<commit_message>
Polish Task 1 assessment report
</commit_message>
<xml_diff>
--- a/Task1_QA_Report_HarshRaj.docx
+++ b/Task1_QA_Report_HarshRaj.docx
@@ -7,7 +7,7 @@
         <w:pStyle w:val="Title"/>
       </w:pPr>
       <w:r>
-        <w:t>Kimai Timesheet QA Report</w:t>
+        <w:t>Kimai Usability and Accessibility Assessment</w:t>
       </w:r>
     </w:p>
     <w:p>
@@ -17,7 +17,7 @@
           <w:color w:val="4E5D6F"/>
           <w:sz w:val="18"/>
         </w:rPr>
-        <w:t>Task 1  |  Kimai 2.67.0 demo  |  Prepared for HarshRaj  |  29 September 2026</w:t>
+        <w:t>Task 1 Submission  |  Prepared by HarshRaj  |  30 September 2026</w:t>
       </w:r>
     </w:p>
     <w:p>
@@ -25,10 +25,13 @@
         <w:rPr>
           <w:b/>
         </w:rPr>
-        <w:t xml:space="preserve">Status. </w:t>
+        <w:t>I identified five reproducible usability and accessibility issues during testing of Kimai 2.67.0.</w:t>
       </w:r>
       <w:r>
-        <w:t>Five reproducible issues are documented below. I tested Kimai 2.67.0 using the public demo account, including login, logout, timesheet creation/editing/deletion, profile preferences, and the calendar. New-user registration is not offered in the public demo. For locale checks, I temporarily set the account to Spanish (Colombia).</w:t>
+        <w:rPr>
+          <w:b w:val="0"/>
+        </w:rPr>
+        <w:t xml:space="preserve"> I reviewed the public demo’s login, logout, timesheet creation, editing and deletion, profile preferences, and calendar. The public demo does not offer registration, so I could not test new-user signup. For locale checks, I temporarily set the account to Spanish (Colombia).</w:t>
       </w:r>
     </w:p>
     <w:p>

</xml_diff>